<commit_message>
Corregir maquetación de los 3 templates (bullets/indentación) y confirmar visualmente
Reemplaza el enfoque de RichText + saltos de línea manuales por párrafos
reales por bullet y por encabezado de puesto, generados con loops nativos
de docxtpl, replicando el ajuste manual validado en Word por Santiago.
Corrige indentación inconsistente, espaciado entre bullets/secciones y
limpieza de párrafos de control sin tocar los espaciadores originales.

Co-Authored-By: Claude Sonnet 5 <noreply@anthropic.com>
</commit_message>
<xml_diff>
--- a/02-modulo2-agente-transformacion/templates/anotados/BD - Resume Template.docx
+++ b/02-modulo2-agente-transformacion/templates/anotados/BD - Resume Template.docx
@@ -51,16 +51,61 @@
     </w:p>
     <w:p>
       <w:pPr>
-        <w:ind w:left="360" w:hanging="360"/>
-      </w:pPr>
-      <w:r>
-        <w:t>{{r summary_skills_block }}</w:t>
-      </w:r>
-    </w:p>
-    <w:p/>
-    <w:p/>
-    <w:p/>
-    <w:p/>
+        <w:ind w:left="0" w:firstLine="0"/>
+      </w:pPr>
+      <w:r>
+        <w:rPr>
+          <w:b w:val="0"/>
+        </w:rPr>
+        <w:t>{{ summary }}</w:t>
+      </w:r>
+    </w:p>
+    <w:p>
+      <w:pPr>
+        <w:ind w:left="0" w:firstLine="0"/>
+      </w:pPr>
+      <w:r>
+        <w:rPr>
+          <w:b w:val="0"/>
+        </w:rPr>
+        <w:t>{% if town %}Resides in {{ town }}.{% endif %}</w:t>
+      </w:r>
+    </w:p>
+    <w:p>
+      <w:pPr>
+        <w:pStyle w:val="CVControlTag"/>
+        <w:ind w:left="0" w:firstLine="0"/>
+      </w:pPr>
+      <w:r>
+        <w:rPr>
+          <w:b w:val="0"/>
+        </w:rPr>
+        <w:t>{% for item in skills_items %}</w:t>
+      </w:r>
+    </w:p>
+    <w:p>
+      <w:pPr>
+        <w:ind w:left="360" w:firstLine="0"/>
+      </w:pPr>
+      <w:r>
+        <w:rPr>
+          <w:b w:val="0"/>
+        </w:rPr>
+        <w:t>• {{ item }}</w:t>
+      </w:r>
+    </w:p>
+    <w:p>
+      <w:pPr>
+        <w:pStyle w:val="CVControlTag"/>
+        <w:ind w:left="0" w:firstLine="0"/>
+      </w:pPr>
+      <w:r>
+        <w:rPr>
+          <w:b w:val="0"/>
+        </w:rPr>
+        <w:t>{% endfor %}</w:t>
+      </w:r>
+    </w:p>
     <w:p>
       <w:pPr>
         <w:rPr>
@@ -80,20 +125,74 @@
     </w:p>
     <w:p>
       <w:pPr>
-        <w:ind w:left="360" w:hanging="360"/>
-      </w:pPr>
-      <w:r>
-        <w:t>{{r experience_block }}</w:t>
-      </w:r>
-    </w:p>
-    <w:p/>
-    <w:p/>
-    <w:p/>
-    <w:p/>
-    <w:p/>
-    <w:p/>
-    <w:p/>
-    <w:p/>
+        <w:pStyle w:val="CVControlTag"/>
+        <w:ind w:left="0" w:firstLine="0"/>
+      </w:pPr>
+      <w:r>
+        <w:rPr>
+          <w:b w:val="0"/>
+        </w:rPr>
+        <w:t>{% for job in experience_jobs %}</w:t>
+      </w:r>
+    </w:p>
+    <w:p>
+      <w:pPr>
+        <w:ind w:left="0" w:firstLine="0"/>
+      </w:pPr>
+      <w:r>
+        <w:rPr>
+          <w:b/>
+        </w:rPr>
+        <w:t>{{ job.header }}</w:t>
+      </w:r>
+    </w:p>
+    <w:p>
+      <w:pPr>
+        <w:pStyle w:val="CVControlTag"/>
+        <w:ind w:left="0" w:firstLine="0"/>
+      </w:pPr>
+      <w:r>
+        <w:rPr>
+          <w:b w:val="0"/>
+        </w:rPr>
+        <w:t>{% for b in job.bullets %}</w:t>
+      </w:r>
+    </w:p>
+    <w:p>
+      <w:pPr>
+        <w:ind w:left="360" w:firstLine="0"/>
+      </w:pPr>
+      <w:r>
+        <w:rPr>
+          <w:b w:val="0"/>
+        </w:rPr>
+        <w:t>• {{ b }}</w:t>
+      </w:r>
+    </w:p>
+    <w:p>
+      <w:pPr>
+        <w:pStyle w:val="CVControlTag"/>
+        <w:ind w:left="0" w:firstLine="0"/>
+      </w:pPr>
+      <w:r>
+        <w:rPr>
+          <w:b w:val="0"/>
+        </w:rPr>
+        <w:t>{% endfor %}</w:t>
+      </w:r>
+    </w:p>
+    <w:p>
+      <w:pPr>
+        <w:pStyle w:val="CVControlTag"/>
+        <w:ind w:left="0" w:firstLine="0"/>
+      </w:pPr>
+      <w:r>
+        <w:rPr>
+          <w:b w:val="0"/>
+        </w:rPr>
+        <w:t>{% endfor %}</w:t>
+      </w:r>
+    </w:p>
     <w:p>
       <w:pPr>
         <w:rPr>
@@ -102,83 +201,56 @@
           <w:u w:val="single"/>
         </w:rPr>
       </w:pPr>
-    </w:p>
-    <w:p>
-      <w:pPr>
+      <w:r>
         <w:rPr>
           <w:b/>
           <w:bCs/>
           <w:u w:val="single"/>
         </w:rPr>
-      </w:pPr>
-    </w:p>
-    <w:p>
-      <w:pPr>
+        <w:t>Education/Certifications</w:t>
+      </w:r>
+      <w:r>
         <w:rPr>
           <w:b/>
           <w:bCs/>
           <w:u w:val="single"/>
         </w:rPr>
-      </w:pPr>
-    </w:p>
-    <w:p>
-      <w:pPr>
-        <w:rPr>
-          <w:b/>
-          <w:bCs/>
-          <w:u w:val="single"/>
-        </w:rPr>
-      </w:pPr>
-    </w:p>
-    <w:p>
-      <w:pPr>
-        <w:rPr>
-          <w:b/>
-          <w:bCs/>
-          <w:u w:val="single"/>
-        </w:rPr>
-      </w:pPr>
-    </w:p>
-    <w:p>
-      <w:pPr>
-        <w:rPr>
-          <w:b/>
-          <w:bCs/>
-          <w:u w:val="single"/>
-        </w:rPr>
-      </w:pPr>
-    </w:p>
-    <w:p>
-      <w:pPr>
-        <w:rPr>
-          <w:b/>
-          <w:bCs/>
-          <w:u w:val="single"/>
-        </w:rPr>
-      </w:pPr>
-      <w:r>
-        <w:rPr>
-          <w:b/>
-          <w:bCs/>
-          <w:u w:val="single"/>
-        </w:rPr>
-        <w:t>Education/Certifications</w:t>
-      </w:r>
-      <w:r>
-        <w:rPr>
-          <w:b/>
-          <w:bCs/>
-          <w:u w:val="single"/>
-        </w:rPr>
         <w:t>/Licenses</w:t>
       </w:r>
     </w:p>
     <w:p>
       <w:pPr>
-        <w:ind w:left="360" w:hanging="360"/>
-      </w:pPr>
-      <w:r>
-        <w:t>{{r education_certifications_block }}</w:t>
+        <w:pStyle w:val="CVControlTag"/>
+        <w:ind w:left="0" w:firstLine="0"/>
+      </w:pPr>
+      <w:r>
+        <w:rPr>
+          <w:b w:val="0"/>
+        </w:rPr>
+        <w:t>{% for item in education_certifications_items %}</w:t>
+      </w:r>
+    </w:p>
+    <w:p>
+      <w:pPr>
+        <w:ind w:left="360" w:firstLine="0"/>
+      </w:pPr>
+      <w:r>
+        <w:rPr>
+          <w:b w:val="0"/>
+        </w:rPr>
+        <w:t>• {{ item }}</w:t>
+      </w:r>
+    </w:p>
+    <w:p>
+      <w:pPr>
+        <w:pStyle w:val="CVControlTag"/>
+        <w:ind w:left="0" w:firstLine="0"/>
+      </w:pPr>
+      <w:r>
+        <w:rPr>
+          <w:b w:val="0"/>
+        </w:rPr>
+        <w:t>{% endfor %}</w:t>
       </w:r>
     </w:p>
     <w:p>
@@ -1134,6 +1206,9 @@
     <w:uiPriority w:val="99"/>
     <w:rsid w:val="00B03D55"/>
   </w:style>
+  <w:style w:type="paragraph" w:customStyle="1" w:styleId="CVControlTag">
+    <w:name w:val="CV Control Tag"/>
+  </w:style>
 </w:styles>
 </file>
 

</xml_diff>